<commit_message>
feat: complete R01-R69 acceptance evidence pack
</commit_message>
<xml_diff>
--- a/files/R01-R69全节点业务验收测试包/00_使用说明与总目录/M00_M00-README-001_TEST-M00-001_使用说明.docx
+++ b/files/R01-R69全节点业务验收测试包/00_使用说明与总目录/M00_M00-README-001_TEST-M00-001_使用说明.docx
@@ -714,7 +714,7 @@
                 <w:color w:val="FFFFFF"/>
                 <w:sz w:val="17"/>
               </w:rPr>
-              <w:t>记录方式</w:t>
+              <w:t>签署形态</w:t>
             </w:r>
           </w:p>
         </w:tc>
@@ -725,9 +725,9 @@
             <w:tcW w:type="dxa" w:w="2268"/>
             <w:vAlign w:val="center"/>
             <w:tcMar>
-              <w:top w:w="70" w:type="dxa"/>
+              <w:top w:w="20" w:type="dxa"/>
               <w:start w:w="90" w:type="dxa"/>
-              <w:bottom w:w="70" w:type="dxa"/>
+              <w:bottom w:w="20" w:type="dxa"/>
               <w:end w:w="90" w:type="dxa"/>
             </w:tcMar>
           </w:tcPr>
@@ -747,9 +747,9 @@
             <w:tcW w:type="dxa" w:w="2268"/>
             <w:vAlign w:val="center"/>
             <w:tcMar>
-              <w:top w:w="70" w:type="dxa"/>
+              <w:top w:w="20" w:type="dxa"/>
               <w:start w:w="90" w:type="dxa"/>
-              <w:bottom w:w="70" w:type="dxa"/>
+              <w:bottom w:w="20" w:type="dxa"/>
               <w:end w:w="90" w:type="dxa"/>
             </w:tcMar>
           </w:tcPr>
@@ -769,9 +769,9 @@
             <w:tcW w:type="dxa" w:w="2268"/>
             <w:vAlign w:val="center"/>
             <w:tcMar>
-              <w:top w:w="70" w:type="dxa"/>
+              <w:top w:w="20" w:type="dxa"/>
               <w:start w:w="90" w:type="dxa"/>
-              <w:bottom w:w="70" w:type="dxa"/>
+              <w:bottom w:w="20" w:type="dxa"/>
               <w:end w:w="90" w:type="dxa"/>
             </w:tcMar>
           </w:tcPr>
@@ -791,20 +791,57 @@
             <w:tcW w:type="dxa" w:w="2268"/>
             <w:vAlign w:val="center"/>
             <w:tcMar>
-              <w:top w:w="70" w:type="dxa"/>
+              <w:top w:w="20" w:type="dxa"/>
               <w:start w:w="90" w:type="dxa"/>
-              <w:bottom w:w="70" w:type="dxa"/>
+              <w:bottom w:w="20" w:type="dxa"/>
               <w:end w:w="90" w:type="dxa"/>
             </w:tcMar>
           </w:tcPr>
           <w:p>
+            <w:pPr>
+              <w:jc w:val="center"/>
+            </w:pPr>
             <w:r>
               <w:rPr>
                 <w:rFonts w:ascii="Arial Unicode MS" w:hAnsi="Arial Unicode MS" w:eastAsia="Arial Unicode MS"/>
                 <w:b w:val="0"/>
                 <w:sz w:val="17"/>
               </w:rPr>
-              <w:t>电子记录（测试）</w:t>
+              <w:t>电子签署（测试）</w:t>
+            </w:r>
+            <w:r>
+              <w:drawing>
+                <wp:inline xmlns:a="http://schemas.openxmlformats.org/drawingml/2006/main" xmlns:pic="http://schemas.openxmlformats.org/drawingml/2006/picture">
+                  <wp:extent cx="648000" cy="261290"/>
+                  <wp:docPr id="1" name="Picture 1"/>
+                  <wp:cNvGraphicFramePr>
+                    <a:graphicFrameLocks noChangeAspect="1"/>
+                  </wp:cNvGraphicFramePr>
+                  <a:graphic>
+                    <a:graphicData uri="http://schemas.openxmlformats.org/drawingml/2006/picture">
+                      <pic:pic>
+                        <pic:nvPicPr>
+                          <pic:cNvPr id="0" name="image.png"/>
+                          <pic:cNvPicPr/>
+                        </pic:nvPicPr>
+                        <pic:blipFill>
+                          <a:blip r:embed="rId11"/>
+                          <a:stretch>
+                            <a:fillRect/>
+                          </a:stretch>
+                        </pic:blipFill>
+                        <pic:spPr>
+                          <a:xfrm>
+                            <a:off x="0" y="0"/>
+                            <a:ext cx="648000" cy="261290"/>
+                          </a:xfrm>
+                          <a:prstGeom prst="rect"/>
+                        </pic:spPr>
+                      </pic:pic>
+                    </a:graphicData>
+                  </a:graphic>
+                </wp:inline>
+              </w:drawing>
             </w:r>
           </w:p>
         </w:tc>
@@ -815,9 +852,9 @@
             <w:tcW w:type="dxa" w:w="2268"/>
             <w:vAlign w:val="center"/>
             <w:tcMar>
-              <w:top w:w="70" w:type="dxa"/>
+              <w:top w:w="20" w:type="dxa"/>
               <w:start w:w="90" w:type="dxa"/>
-              <w:bottom w:w="70" w:type="dxa"/>
+              <w:bottom w:w="20" w:type="dxa"/>
               <w:end w:w="90" w:type="dxa"/>
             </w:tcMar>
           </w:tcPr>
@@ -837,9 +874,9 @@
             <w:tcW w:type="dxa" w:w="2268"/>
             <w:vAlign w:val="center"/>
             <w:tcMar>
-              <w:top w:w="70" w:type="dxa"/>
+              <w:top w:w="20" w:type="dxa"/>
               <w:start w:w="90" w:type="dxa"/>
-              <w:bottom w:w="70" w:type="dxa"/>
+              <w:bottom w:w="20" w:type="dxa"/>
               <w:end w:w="90" w:type="dxa"/>
             </w:tcMar>
           </w:tcPr>
@@ -859,9 +896,9 @@
             <w:tcW w:type="dxa" w:w="2268"/>
             <w:vAlign w:val="center"/>
             <w:tcMar>
-              <w:top w:w="70" w:type="dxa"/>
+              <w:top w:w="20" w:type="dxa"/>
               <w:start w:w="90" w:type="dxa"/>
-              <w:bottom w:w="70" w:type="dxa"/>
+              <w:bottom w:w="20" w:type="dxa"/>
               <w:end w:w="90" w:type="dxa"/>
             </w:tcMar>
           </w:tcPr>
@@ -881,20 +918,57 @@
             <w:tcW w:type="dxa" w:w="2268"/>
             <w:vAlign w:val="center"/>
             <w:tcMar>
-              <w:top w:w="70" w:type="dxa"/>
+              <w:top w:w="20" w:type="dxa"/>
               <w:start w:w="90" w:type="dxa"/>
-              <w:bottom w:w="70" w:type="dxa"/>
+              <w:bottom w:w="20" w:type="dxa"/>
               <w:end w:w="90" w:type="dxa"/>
             </w:tcMar>
           </w:tcPr>
           <w:p>
+            <w:pPr>
+              <w:jc w:val="center"/>
+            </w:pPr>
             <w:r>
               <w:rPr>
                 <w:rFonts w:ascii="Arial Unicode MS" w:hAnsi="Arial Unicode MS" w:eastAsia="Arial Unicode MS"/>
                 <w:b w:val="0"/>
                 <w:sz w:val="17"/>
               </w:rPr>
-              <w:t>电子记录（测试）</w:t>
+              <w:t>电子签署（测试）</w:t>
+            </w:r>
+            <w:r>
+              <w:drawing>
+                <wp:inline xmlns:a="http://schemas.openxmlformats.org/drawingml/2006/main" xmlns:pic="http://schemas.openxmlformats.org/drawingml/2006/picture">
+                  <wp:extent cx="648000" cy="261290"/>
+                  <wp:docPr id="2" name="Picture 2"/>
+                  <wp:cNvGraphicFramePr>
+                    <a:graphicFrameLocks noChangeAspect="1"/>
+                  </wp:cNvGraphicFramePr>
+                  <a:graphic>
+                    <a:graphicData uri="http://schemas.openxmlformats.org/drawingml/2006/picture">
+                      <pic:pic>
+                        <pic:nvPicPr>
+                          <pic:cNvPr id="0" name="image.png"/>
+                          <pic:cNvPicPr/>
+                        </pic:nvPicPr>
+                        <pic:blipFill>
+                          <a:blip r:embed="rId12"/>
+                          <a:stretch>
+                            <a:fillRect/>
+                          </a:stretch>
+                        </pic:blipFill>
+                        <pic:spPr>
+                          <a:xfrm>
+                            <a:off x="0" y="0"/>
+                            <a:ext cx="648000" cy="261290"/>
+                          </a:xfrm>
+                          <a:prstGeom prst="rect"/>
+                        </pic:spPr>
+                      </pic:pic>
+                    </a:graphicData>
+                  </a:graphic>
+                </wp:inline>
+              </w:drawing>
             </w:r>
           </w:p>
         </w:tc>
@@ -905,9 +979,9 @@
             <w:tcW w:type="dxa" w:w="2268"/>
             <w:vAlign w:val="center"/>
             <w:tcMar>
-              <w:top w:w="70" w:type="dxa"/>
+              <w:top w:w="20" w:type="dxa"/>
               <w:start w:w="90" w:type="dxa"/>
-              <w:bottom w:w="70" w:type="dxa"/>
+              <w:bottom w:w="20" w:type="dxa"/>
               <w:end w:w="90" w:type="dxa"/>
             </w:tcMar>
           </w:tcPr>
@@ -927,9 +1001,9 @@
             <w:tcW w:type="dxa" w:w="2268"/>
             <w:vAlign w:val="center"/>
             <w:tcMar>
-              <w:top w:w="70" w:type="dxa"/>
+              <w:top w:w="20" w:type="dxa"/>
               <w:start w:w="90" w:type="dxa"/>
-              <w:bottom w:w="70" w:type="dxa"/>
+              <w:bottom w:w="20" w:type="dxa"/>
               <w:end w:w="90" w:type="dxa"/>
             </w:tcMar>
           </w:tcPr>
@@ -949,9 +1023,9 @@
             <w:tcW w:type="dxa" w:w="2268"/>
             <w:vAlign w:val="center"/>
             <w:tcMar>
-              <w:top w:w="70" w:type="dxa"/>
+              <w:top w:w="20" w:type="dxa"/>
               <w:start w:w="90" w:type="dxa"/>
-              <w:bottom w:w="70" w:type="dxa"/>
+              <w:bottom w:w="20" w:type="dxa"/>
               <w:end w:w="90" w:type="dxa"/>
             </w:tcMar>
           </w:tcPr>
@@ -971,20 +1045,57 @@
             <w:tcW w:type="dxa" w:w="2268"/>
             <w:vAlign w:val="center"/>
             <w:tcMar>
-              <w:top w:w="70" w:type="dxa"/>
+              <w:top w:w="20" w:type="dxa"/>
               <w:start w:w="90" w:type="dxa"/>
-              <w:bottom w:w="70" w:type="dxa"/>
+              <w:bottom w:w="20" w:type="dxa"/>
               <w:end w:w="90" w:type="dxa"/>
             </w:tcMar>
           </w:tcPr>
           <w:p>
+            <w:pPr>
+              <w:jc w:val="center"/>
+            </w:pPr>
             <w:r>
               <w:rPr>
                 <w:rFonts w:ascii="Arial Unicode MS" w:hAnsi="Arial Unicode MS" w:eastAsia="Arial Unicode MS"/>
                 <w:b w:val="0"/>
                 <w:sz w:val="17"/>
               </w:rPr>
-              <w:t>电子记录（测试）</w:t>
+              <w:t>电子签署（测试）</w:t>
+            </w:r>
+            <w:r>
+              <w:drawing>
+                <wp:inline xmlns:a="http://schemas.openxmlformats.org/drawingml/2006/main" xmlns:pic="http://schemas.openxmlformats.org/drawingml/2006/picture">
+                  <wp:extent cx="648000" cy="261290"/>
+                  <wp:docPr id="3" name="Picture 3"/>
+                  <wp:cNvGraphicFramePr>
+                    <a:graphicFrameLocks noChangeAspect="1"/>
+                  </wp:cNvGraphicFramePr>
+                  <a:graphic>
+                    <a:graphicData uri="http://schemas.openxmlformats.org/drawingml/2006/picture">
+                      <pic:pic>
+                        <pic:nvPicPr>
+                          <pic:cNvPr id="0" name="image.png"/>
+                          <pic:cNvPicPr/>
+                        </pic:nvPicPr>
+                        <pic:blipFill>
+                          <a:blip r:embed="rId13"/>
+                          <a:stretch>
+                            <a:fillRect/>
+                          </a:stretch>
+                        </pic:blipFill>
+                        <pic:spPr>
+                          <a:xfrm>
+                            <a:off x="0" y="0"/>
+                            <a:ext cx="648000" cy="261290"/>
+                          </a:xfrm>
+                          <a:prstGeom prst="rect"/>
+                        </pic:spPr>
+                      </pic:pic>
+                    </a:graphicData>
+                  </a:graphic>
+                </wp:inline>
+              </w:drawing>
             </w:r>
           </w:p>
         </w:tc>

</xml_diff>